<commit_message>
Extend C803 courseware to 2 days / 15 hours (v1.2): 9:30-17:30 house day, Day 2 labs + applied practice
Co-Authored-By: Claude Opus 5.5 <noreply@anthropic.com>
</commit_message>
<xml_diff>
--- a/courseware/LG-Microsoft Copilot for Power Apps (C803).docx
+++ b/courseware/LG-Microsoft Copilot for Power Apps (C803).docx
@@ -179,7 +179,7 @@
           <w:color w:val="1F6FEB"/>
           <w:sz w:val="24"/>
         </w:rPr>
-        <w:t>Version 1.1</w:t>
+        <w:t>Version 1.2</w:t>
       </w:r>
     </w:p>
     <w:p>
@@ -399,6 +399,64 @@
           </w:p>
         </w:tc>
       </w:tr>
+      <w:tr>
+        <w:tc>
+          <w:tcPr>
+            <w:tcW w:type="dxa" w:w="2160"/>
+          </w:tcPr>
+          <w:p>
+            <w:r/>
+            <w:r>
+              <w:rPr>
+                <w:sz w:val="19"/>
+              </w:rPr>
+              <w:t>1.2</w:t>
+            </w:r>
+          </w:p>
+        </w:tc>
+        <w:tc>
+          <w:tcPr>
+            <w:tcW w:type="dxa" w:w="2160"/>
+          </w:tcPr>
+          <w:p>
+            <w:r/>
+            <w:r>
+              <w:rPr>
+                <w:sz w:val="19"/>
+              </w:rPr>
+              <w:t>4 October 2026</w:t>
+            </w:r>
+          </w:p>
+        </w:tc>
+        <w:tc>
+          <w:tcPr>
+            <w:tcW w:type="dxa" w:w="2160"/>
+          </w:tcPr>
+          <w:p>
+            <w:r/>
+            <w:r>
+              <w:rPr>
+                <w:sz w:val="19"/>
+              </w:rPr>
+              <w:t>Extended to two days (15 hours): longer hands-on labs and a Day 2 applied-practice block.</w:t>
+            </w:r>
+          </w:p>
+        </w:tc>
+        <w:tc>
+          <w:tcPr>
+            <w:tcW w:type="dxa" w:w="2160"/>
+          </w:tcPr>
+          <w:p>
+            <w:r/>
+            <w:r>
+              <w:rPr>
+                <w:sz w:val="19"/>
+              </w:rPr>
+              <w:t>Dr. Alfred Ang</w:t>
+            </w:r>
+          </w:p>
+        </w:tc>
+      </w:tr>
     </w:tbl>
     <w:p>
       <w:r>
@@ -939,7 +997,7 @@
         <w:pStyle w:val="ListBullet"/>
       </w:pPr>
       <w:r>
-        <w:t>A Power Apps environment with Dataverse and Copilot enabled — the trainer confirms your environment and that Copilot is switched on at the start of the day.</w:t>
+        <w:t>A Power Apps environment with Dataverse and Copilot enabled — the trainer confirms your environment and that Copilot is switched on at the start of Day 1.</w:t>
       </w:r>
     </w:p>
     <w:p>
@@ -3476,7 +3534,7 @@
     </w:p>
     <w:p>
       <w:r>
-        <w:t>In one day you have taken a facilities team's everyday need — logging, approving and tracking maintenance requests — and turned it into a working, automated Power Apps solution, using Copilot at every step and checking its work before publishing.</w:t>
+        <w:t>Over two days you have taken a facilities team's everyday need — logging, approving and tracking maintenance requests — and turned it into a working, automated Power Apps solution, using Copilot at every step and checking its work before publishing.</w:t>
       </w:r>
     </w:p>
     <w:p>

</xml_diff>